<commit_message>
Docs: actualiza la documentación y las capturas a la versión final
- guia_frontend (md y pdf): sección de novedades, tres pestañas, modo
  claro / oscuro, vista móvil, botón Limpiar, guía de lectura, aviso de
  ubicación, validación de coordenadas y dashboard de métricas, con 11
  capturas nuevas.
- README: novedades y correcciones de la versión final, capturas,
  validación de entradas de la API y 28 tests.
- Informe de Avance y guía del proyecto (docx y pdf): mejoras posteriores
  a la devolución, tests, frontend y problemas frecuentes.
- Pre-Entregas 3 y 4: mención a la pestaña Métricas del modelo.
- El ejemplo de idpozo (159640) no existía: Swagger, README y el buscador
  usan 166848 (PLU.Nq.LCa-3039(h)).

Co-Authored-By: Claude Opus 5.5 <noreply@anthropic.com>
</commit_message>
<xml_diff>
--- a/docs/Informe_Avance_Proyecto_YPF.docx
+++ b/docs/Informe_Avance_Proyecto_YPF.docx
@@ -148,12 +148,13 @@
             <w:tcW w:type="dxa" w:w="6860"/>
           </w:tcPr>
           <w:p>
-            <w:r/>
+            <w:r>
+              <w:t>Versión 2 — Cuenca Neuquina, petróleo y gas (actualizado al 28 de octubre de 2026)</w:t>
+            </w:r>
             <w:r>
               <w:rPr>
                 <w:sz w:val="19"/>
               </w:rPr>
-              <w:t>Versión 2 — Cuenca Neuquina, petróleo y gas (actualizado al 23 de octubre de 2026)</w:t>
             </w:r>
           </w:p>
         </w:tc>
@@ -174,7 +175,7 @@
     </w:p>
     <w:p>
       <w:r>
-        <w:t>La versión 2 del proyecto está completa: datos limpios, cuatro modelos supervisados, clustering, explicabilidad, API, frontend, Docker Compose, tests y documentación. Se presenta como pull request (rama feature/v2-neuquina) sobre la versión 1 del repositorio.</w:t>
+        <w:t>La versión 2 del proyecto está completa e integrada en main: datos limpios, cuatro modelos supervisados, clustering, explicabilidad, API, frontend con dashboard de métricas, Docker Compose, 28 tests y documentación. Además se atendieron las dos recomendaciones de la devolución de la pre-entrega.</w:t>
       </w:r>
     </w:p>
     <w:tbl>
@@ -479,12 +480,13 @@
             <w:tcW w:type="dxa" w:w="1701"/>
           </w:tcPr>
           <w:p>
-            <w:r/>
+            <w:r>
+              <w:t>Funcionando</w:t>
+            </w:r>
             <w:r>
               <w:rPr>
                 <w:sz w:val="19"/>
               </w:rPr>
-              <w:t>Funcionando</w:t>
             </w:r>
           </w:p>
         </w:tc>
@@ -493,12 +495,13 @@
             <w:tcW w:type="dxa" w:w="4309"/>
           </w:tcPr>
           <w:p>
-            <w:r/>
+            <w:r>
+              <w:t>api/, frontend/ (3 pestañas, dashboard de métricas), compose.yaml</w:t>
+            </w:r>
             <w:r>
               <w:rPr>
                 <w:sz w:val="19"/>
               </w:rPr>
-              <w:t>api/, frontend/, compose.yaml</w:t>
             </w:r>
           </w:p>
         </w:tc>
@@ -523,12 +526,13 @@
             <w:tcW w:type="dxa" w:w="1701"/>
           </w:tcPr>
           <w:p>
-            <w:r/>
+            <w:r>
+              <w:t>28 tests pasan</w:t>
+            </w:r>
             <w:r>
               <w:rPr>
                 <w:sz w:val="19"/>
               </w:rPr>
-              <w:t>15 tests pasan</w:t>
             </w:r>
           </w:p>
         </w:tc>
@@ -543,6 +547,53 @@
                 <w:sz w:val="19"/>
               </w:rPr>
               <w:t>tests/</w:t>
+            </w:r>
+          </w:p>
+        </w:tc>
+      </w:tr>
+      <w:tr>
+        <w:tc>
+          <w:tcPr>
+            <w:tcW w:type="dxa" w:w="3402"/>
+          </w:tcPr>
+          <w:p>
+            <w:r>
+              <w:t>Devolución de la pre-entrega</w:t>
+            </w:r>
+            <w:r>
+              <w:rPr>
+                <w:sz w:val="19"/>
+              </w:rPr>
+            </w:r>
+          </w:p>
+        </w:tc>
+        <w:tc>
+          <w:tcPr>
+            <w:tcW w:type="dxa" w:w="1701"/>
+          </w:tcPr>
+          <w:p>
+            <w:r>
+              <w:t>Atendida</w:t>
+            </w:r>
+            <w:r>
+              <w:rPr>
+                <w:sz w:val="19"/>
+              </w:rPr>
+            </w:r>
+          </w:p>
+        </w:tc>
+        <w:tc>
+          <w:tcPr>
+            <w:tcW w:type="dxa" w:w="4309"/>
+          </w:tcPr>
+          <w:p>
+            <w:r>
+              <w:t>Validación de coordenadas y memoria de la API</w:t>
+            </w:r>
+            <w:r>
+              <w:rPr>
+                <w:sz w:val="19"/>
+              </w:rPr>
             </w:r>
           </w:p>
         </w:tc>
@@ -1141,12 +1192,13 @@
             <w:tcW w:type="dxa" w:w="4309"/>
           </w:tcPr>
           <w:p>
-            <w:r/>
+            <w:r>
+              <w:t>Tres pestañas (existente, nuevo y métricas), gráficos con bandas, SHAP, cluster, avisos, guía de lectura y modo claro / oscuro</w:t>
+            </w:r>
             <w:r>
               <w:rPr>
                 <w:sz w:val="19"/>
               </w:rPr>
-              <w:t>Dos modos, gráficos con bandas, SHAP, cluster y avisos</w:t>
             </w:r>
           </w:p>
         </w:tc>
@@ -1185,12 +1237,13 @@
             <w:tcW w:type="dxa" w:w="4309"/>
           </w:tcPr>
           <w:p>
-            <w:r/>
+            <w:r>
+              <w:t>28 tests (limpieza, ausencia de fuga, API y validación de entradas)</w:t>
+            </w:r>
             <w:r>
               <w:rPr>
                 <w:sz w:val="19"/>
               </w:rPr>
-              <w:t>15 tests (limpieza, ausencia de fuga, API)</w:t>
             </w:r>
           </w:p>
         </w:tc>
@@ -1318,7 +1371,10 @@
         <w:pStyle w:val="Heading1"/>
       </w:pPr>
       <w:r>
-        <w:t>5. Próximos pasos</w:t>
+        <w:rPr>
+          <w:b/>
+        </w:rPr>
+        <w:t>5. Mejoras posteriores a la devolución</w:t>
       </w:r>
     </w:p>
     <w:p>
@@ -1326,7 +1382,83 @@
         <w:pStyle w:val="ListBullet"/>
       </w:pPr>
       <w:r>
-        <w:t>Revisión del pull request por el equipo y merge a main.</w:t>
+        <w:rPr>
+          <w:b/>
+        </w:rPr>
+        <w:t xml:space="preserve">Validación de coordenadas: </w:t>
+      </w:r>
+      <w:r>
+        <w:rPr>
+          <w:b w:val="0"/>
+        </w:rPr>
+        <w:t>la API rechaza pozos nuevos fuera de la Cuenca Neuquina (lat −40 a −34, lon −70,5 a −67, a partir de los pozos reales con medio grado de margen) y avisa si el pozo queda a más de 50 km del área elegida.</w:t>
+      </w:r>
+    </w:p>
+    <w:p>
+      <w:pPr>
+        <w:pStyle w:val="ListBullet"/>
+      </w:pPr>
+      <w:r>
+        <w:rPr>
+          <w:b/>
+        </w:rPr>
+        <w:t xml:space="preserve">Memoria de la API: </w:t>
+      </w:r>
+      <w:r>
+        <w:rPr>
+          <w:b w:val="0"/>
+        </w:rPr>
+        <w:t>medida con docker stats, bajó de 921 MB a 336 MB. Los .joblib pesan 7,4 MB y no eran la causa; el consumo venía de usar 2 workers de uvicorn (cada uno con su copia de modelos y datos) y de los hilos de Polars al leer el panel. Se dejó 1 worker, Polars con 2 hilos y un tope de 1 GB.</w:t>
+      </w:r>
+    </w:p>
+    <w:p>
+      <w:pPr>
+        <w:pStyle w:val="ListBullet"/>
+      </w:pPr>
+      <w:r>
+        <w:rPr>
+          <w:b/>
+        </w:rPr>
+        <w:t xml:space="preserve">Frontend: </w:t>
+      </w:r>
+      <w:r>
+        <w:rPr>
+          <w:b w:val="0"/>
+        </w:rPr>
+        <w:t>rediseño con modo claro / oscuro, pestaña “Métricas del modelo” con 8 gráficos y una guía “Cómo leer este gráfico” junto a cada uno.</w:t>
+      </w:r>
+    </w:p>
+    <w:p>
+      <w:pPr>
+        <w:pStyle w:val="ListBullet"/>
+      </w:pPr>
+      <w:r>
+        <w:rPr>
+          <w:b/>
+        </w:rPr>
+        <w:t xml:space="preserve">Correcciones: </w:t>
+      </w:r>
+      <w:r>
+        <w:rPr>
+          <w:b w:val="0"/>
+        </w:rPr>
+        <w:t>los pozos sin producción en su último mes ya no rompen la pantalla, y el ejemplo de la API usa un idpozo existente.</w:t>
+      </w:r>
+    </w:p>
+    <w:p>
+      <w:pPr>
+        <w:pStyle w:val="Heading1"/>
+      </w:pPr>
+      <w:r>
+        <w:t>6. Próximos pasos</w:t>
+      </w:r>
+    </w:p>
+    <w:p>
+      <w:pPr>
+        <w:pStyle w:val="ListBullet"/>
+      </w:pPr>
+      <w:r>
+        <w:t>Ensayar la demo con pozos de ejemplo: LCa-3039 (pozo existente) y un pozo nuevo en Loma Campana.</w:t>
       </w:r>
     </w:p>
     <w:p>

</xml_diff>